<commit_message>
Make site layout wider
</commit_message>
<xml_diff>
--- a/Gennadii_Kiryushatov_Sr_iOS_SDET_Resume.docx
+++ b/Gennadii_Kiryushatov_Sr_iOS_SDET_Resume.docx
@@ -22,24 +22,7 @@
           <w:rFonts w:ascii="Times New Roman" w:hAnsi="Times New Roman"/>
         </w:rPr>
         <w:br/>
-        <w:t xml:space="preserve">Austin, TX Area | (469) 230-4471 | </w:t>
-      </w:r>
-      <w:r>
-        <w:rPr>
-          <w:rFonts w:ascii="Times New Roman" w:hAnsi="Times New Roman"/>
-        </w:rPr>
-        <w:t>e-</w:t>
-      </w:r>
-      <w:r>
-        <w:rPr>
-          <w:rFonts w:ascii="Times New Roman" w:hAnsi="Times New Roman"/>
-        </w:rPr>
-        <w:t>mail: genakir@icloud.com</w:t>
-      </w:r>
-      <w:r>
-        <w:rPr>
-          <w:rFonts w:ascii="Times New Roman" w:eastAsia="Times New Roman" w:hAnsi="Times New Roman" w:cs="Times New Roman"/>
-        </w:rPr>
+        <w:t>Austin, TX Area | e-mail: genakir@icloud.com | LinkedIn: linkedin.com/in/genakir</w:t>
         <w:br/>
       </w:r>
     </w:p>

</xml_diff>